<commit_message>
Updated Percussion Key and Front Matter
</commit_message>
<xml_diff>
--- a/2 Proofreading and Review/LARA Mosaic Maze - Errata_v5.docx
+++ b/2 Proofreading and Review/LARA Mosaic Maze - Errata_v5.docx
@@ -58,31 +58,17 @@
           <w:ilvl w:val="0"/>
           <w:numId w:val="1"/>
         </w:numPr>
-        <w:rPr>
-          <w:b/>
-          <w:bCs/>
-        </w:rPr>
-      </w:pPr>
-      <w:r>
-        <w:rPr>
-          <w:b/>
-          <w:bCs/>
-        </w:rPr>
+      </w:pPr>
+      <w:r>
         <w:t>Cover: remove Version number from cover…make it very clear on the page after cover, something like: Anima Vera Music@2024 (1</w:t>
       </w:r>
       <w:r>
         <w:rPr>
-          <w:b/>
-          <w:bCs/>
           <w:vertAlign w:val="superscript"/>
         </w:rPr>
         <w:t>st</w:t>
       </w:r>
       <w:r>
-        <w:rPr>
-          <w:b/>
-          <w:bCs/>
-        </w:rPr>
         <w:t xml:space="preserve"> edition – Version 4).</w:t>
       </w:r>
     </w:p>
@@ -101,97 +87,61 @@
           <w:ilvl w:val="0"/>
           <w:numId w:val="1"/>
         </w:numPr>
-        <w:rPr>
-          <w:b/>
-          <w:bCs/>
-        </w:rPr>
       </w:pPr>
       <w:proofErr w:type="spellStart"/>
       <w:r>
-        <w:rPr>
-          <w:b/>
-          <w:bCs/>
-        </w:rPr>
         <w:t>Durata</w:t>
       </w:r>
       <w:proofErr w:type="spellEnd"/>
       <w:r>
-        <w:rPr>
-          <w:b/>
-          <w:bCs/>
-        </w:rPr>
         <w:t>: I think the duration is more like 14 or 15 mins or so</w:t>
       </w:r>
-      <w:r>
-        <w:rPr>
-          <w:b/>
-          <w:bCs/>
-        </w:rPr>
-        <w:t xml:space="preserve">….with repeated bars, so many fermatas </w:t>
+      <w:proofErr w:type="gramStart"/>
+      <w:r>
+        <w:t>….with</w:t>
+      </w:r>
+      <w:proofErr w:type="gramEnd"/>
+      <w:r>
+        <w:t xml:space="preserve"> repeated bars, so many fermatas </w:t>
       </w:r>
       <w:proofErr w:type="spellStart"/>
       <w:r>
-        <w:rPr>
-          <w:b/>
-          <w:bCs/>
-        </w:rPr>
         <w:t>etc</w:t>
       </w:r>
       <w:proofErr w:type="spellEnd"/>
       <w:r>
-        <w:rPr>
-          <w:b/>
-          <w:bCs/>
-        </w:rPr>
         <w:t xml:space="preserve"> </w:t>
       </w:r>
-    </w:p>
-    <w:p>
-      <w:pPr>
-        <w:rPr>
-          <w:b/>
-          <w:bCs/>
-        </w:rPr>
-      </w:pPr>
-    </w:p>
-    <w:p>
-      <w:pPr>
-        <w:pStyle w:val="ListParagraph"/>
-        <w:numPr>
-          <w:ilvl w:val="0"/>
-          <w:numId w:val="1"/>
-        </w:numPr>
-        <w:rPr>
-          <w:b/>
-          <w:bCs/>
-        </w:rPr>
-      </w:pPr>
-      <w:r>
-        <w:rPr>
-          <w:b/>
-          <w:bCs/>
-        </w:rPr>
+      <w:r>
+        <w:t>– 13:30 CONFIRMED</w:t>
+      </w:r>
+    </w:p>
+    <w:p>
+      <w:pPr>
+        <w:rPr>
+          <w:b/>
+          <w:bCs/>
+        </w:rPr>
+      </w:pPr>
+    </w:p>
+    <w:p>
+      <w:pPr>
+        <w:pStyle w:val="ListParagraph"/>
+        <w:numPr>
+          <w:ilvl w:val="0"/>
+          <w:numId w:val="1"/>
+        </w:numPr>
+      </w:pPr>
+      <w:r>
         <w:t>Maybe add</w:t>
       </w:r>
       <w:r>
-        <w:rPr>
-          <w:b/>
-          <w:bCs/>
-        </w:rPr>
         <w:t xml:space="preserve"> the dedication</w:t>
       </w:r>
       <w:r>
-        <w:rPr>
-          <w:b/>
-          <w:bCs/>
-        </w:rPr>
         <w:t xml:space="preserve"> “for the Grossman Ensemble” </w:t>
       </w:r>
       <w:r>
-        <w:rPr>
-          <w:b/>
-          <w:bCs/>
-        </w:rPr>
         <w:t>somewhere nice in the intro pages.</w:t>
       </w:r>
     </w:p>
@@ -264,8 +214,13 @@
         </w:numPr>
       </w:pPr>
       <w:r>
-        <w:t>M75, perc 1: add another note on the space above (if it was treble clef would be F and A), I’d like to have two drums played at once</w:t>
-      </w:r>
+        <w:t xml:space="preserve">M75, perc 1: add another note on the space above (if it was treble clef would be F and A), I’d like to have two drums played at </w:t>
+      </w:r>
+      <w:proofErr w:type="gramStart"/>
+      <w:r>
+        <w:t>once</w:t>
+      </w:r>
+      <w:proofErr w:type="gramEnd"/>
     </w:p>
     <w:p>
       <w:pPr>
@@ -337,28 +292,44 @@
         <w:t>” and with normal notehead</w:t>
       </w:r>
       <w:r>
-        <w:t>, Also add downbow symbol</w:t>
-      </w:r>
-    </w:p>
-    <w:p>
-      <w:pPr>
-        <w:pStyle w:val="ListParagraph"/>
-        <w:rPr>
-          <w:b/>
-          <w:bCs/>
-        </w:rPr>
-      </w:pPr>
-    </w:p>
-    <w:p>
-      <w:pPr>
-        <w:pStyle w:val="ListParagraph"/>
-        <w:numPr>
-          <w:ilvl w:val="0"/>
-          <w:numId w:val="1"/>
-        </w:numPr>
-      </w:pPr>
-      <w:r>
-        <w:t>M127, marimba: add “medium mallet”</w:t>
+        <w:t xml:space="preserve">, </w:t>
+      </w:r>
+      <w:proofErr w:type="gramStart"/>
+      <w:r>
+        <w:t>Also</w:t>
+      </w:r>
+      <w:proofErr w:type="gramEnd"/>
+      <w:r>
+        <w:t xml:space="preserve"> add downbow symbol</w:t>
+      </w:r>
+    </w:p>
+    <w:p>
+      <w:pPr>
+        <w:pStyle w:val="ListParagraph"/>
+        <w:rPr>
+          <w:b/>
+          <w:bCs/>
+        </w:rPr>
+      </w:pPr>
+    </w:p>
+    <w:p>
+      <w:pPr>
+        <w:pStyle w:val="ListParagraph"/>
+        <w:numPr>
+          <w:ilvl w:val="0"/>
+          <w:numId w:val="1"/>
+        </w:numPr>
+      </w:pPr>
+      <w:r>
+        <w:t xml:space="preserve">M127, marimba: add “medium </w:t>
+      </w:r>
+      <w:proofErr w:type="gramStart"/>
+      <w:r>
+        <w:t>mallet</w:t>
+      </w:r>
+      <w:proofErr w:type="gramEnd"/>
+      <w:r>
+        <w:t>”</w:t>
       </w:r>
     </w:p>
     <w:p>
@@ -387,143 +358,145 @@
       </w:r>
       <w:proofErr w:type="spellEnd"/>
       <w:r>
-        <w:t>/dim</w:t>
-      </w:r>
-    </w:p>
-    <w:p>
-      <w:pPr>
-        <w:pStyle w:val="ListParagraph"/>
-        <w:rPr>
-          <w:b/>
-          <w:bCs/>
-        </w:rPr>
-      </w:pPr>
-    </w:p>
-    <w:p>
-      <w:pPr>
-        <w:pStyle w:val="ListParagraph"/>
-        <w:numPr>
-          <w:ilvl w:val="0"/>
-          <w:numId w:val="1"/>
-        </w:numPr>
-      </w:pPr>
-      <w:r>
-        <w:t>M161, viola: should be a whole note</w:t>
-      </w:r>
-    </w:p>
-    <w:p>
-      <w:pPr>
-        <w:pStyle w:val="ListParagraph"/>
-        <w:rPr>
-          <w:b/>
-          <w:bCs/>
-        </w:rPr>
-      </w:pPr>
-    </w:p>
-    <w:p>
-      <w:pPr>
-        <w:pStyle w:val="ListParagraph"/>
-        <w:numPr>
-          <w:ilvl w:val="0"/>
-          <w:numId w:val="1"/>
-        </w:numPr>
-      </w:pPr>
-      <w:r>
-        <w:t>M170, flute: make G# into G3/4 sharp</w:t>
-      </w:r>
-    </w:p>
-    <w:p>
-      <w:pPr>
-        <w:pStyle w:val="ListParagraph"/>
-        <w:rPr>
-          <w:b/>
-          <w:bCs/>
-        </w:rPr>
-      </w:pPr>
-    </w:p>
-    <w:p>
-      <w:pPr>
-        <w:pStyle w:val="ListParagraph"/>
-        <w:numPr>
-          <w:ilvl w:val="0"/>
-          <w:numId w:val="1"/>
-        </w:numPr>
-        <w:rPr>
-          <w:b/>
-          <w:bCs/>
-        </w:rPr>
-      </w:pPr>
-      <w:r>
-        <w:rPr>
-          <w:b/>
-          <w:bCs/>
-        </w:rPr>
+        <w:t>/</w:t>
+      </w:r>
+      <w:proofErr w:type="gramStart"/>
+      <w:r>
+        <w:t>dim</w:t>
+      </w:r>
+      <w:proofErr w:type="gramEnd"/>
+    </w:p>
+    <w:p>
+      <w:pPr>
+        <w:pStyle w:val="ListParagraph"/>
+        <w:rPr>
+          <w:b/>
+          <w:bCs/>
+        </w:rPr>
+      </w:pPr>
+    </w:p>
+    <w:p>
+      <w:pPr>
+        <w:pStyle w:val="ListParagraph"/>
+        <w:numPr>
+          <w:ilvl w:val="0"/>
+          <w:numId w:val="1"/>
+        </w:numPr>
+      </w:pPr>
+      <w:r>
+        <w:t xml:space="preserve">M161, viola: should be a whole </w:t>
+      </w:r>
+      <w:proofErr w:type="gramStart"/>
+      <w:r>
+        <w:t>note</w:t>
+      </w:r>
+      <w:proofErr w:type="gramEnd"/>
+    </w:p>
+    <w:p>
+      <w:pPr>
+        <w:pStyle w:val="ListParagraph"/>
+        <w:rPr>
+          <w:b/>
+          <w:bCs/>
+        </w:rPr>
+      </w:pPr>
+    </w:p>
+    <w:p>
+      <w:pPr>
+        <w:pStyle w:val="ListParagraph"/>
+        <w:numPr>
+          <w:ilvl w:val="0"/>
+          <w:numId w:val="1"/>
+        </w:numPr>
+      </w:pPr>
+      <w:r>
+        <w:t xml:space="preserve">M170, flute: make G# into G3/4 </w:t>
+      </w:r>
+      <w:proofErr w:type="gramStart"/>
+      <w:r>
+        <w:t>sharp</w:t>
+      </w:r>
+      <w:proofErr w:type="gramEnd"/>
+    </w:p>
+    <w:p>
+      <w:pPr>
+        <w:pStyle w:val="ListParagraph"/>
+        <w:rPr>
+          <w:b/>
+          <w:bCs/>
+        </w:rPr>
+      </w:pPr>
+    </w:p>
+    <w:p>
+      <w:pPr>
+        <w:pStyle w:val="ListParagraph"/>
+        <w:numPr>
+          <w:ilvl w:val="0"/>
+          <w:numId w:val="1"/>
+        </w:numPr>
+      </w:pPr>
+      <w:r>
         <w:t xml:space="preserve">M176, 177, 178, 179: Make measure size more </w:t>
       </w:r>
       <w:r>
-        <w:rPr>
-          <w:b/>
-          <w:bCs/>
-        </w:rPr>
         <w:t>homogeneous</w:t>
       </w:r>
       <w:r>
-        <w:rPr>
-          <w:b/>
-          <w:bCs/>
-        </w:rPr>
-        <w:t xml:space="preserve"> for these bars</w:t>
-      </w:r>
-    </w:p>
-    <w:p>
-      <w:pPr>
-        <w:pStyle w:val="ListParagraph"/>
-        <w:rPr>
-          <w:b/>
-          <w:bCs/>
-        </w:rPr>
-      </w:pPr>
-    </w:p>
-    <w:p>
-      <w:pPr>
-        <w:pStyle w:val="ListParagraph"/>
-        <w:numPr>
-          <w:ilvl w:val="0"/>
-          <w:numId w:val="1"/>
-        </w:numPr>
-        <w:rPr>
-          <w:b/>
-          <w:bCs/>
-        </w:rPr>
-      </w:pPr>
-      <w:r>
-        <w:rPr>
-          <w:b/>
-          <w:bCs/>
-        </w:rPr>
-        <w:t>M184-185: Make measure size more homogeneous for these bars</w:t>
-      </w:r>
-    </w:p>
-    <w:p>
-      <w:pPr>
-        <w:pStyle w:val="ListParagraph"/>
-        <w:rPr>
-          <w:b/>
-          <w:bCs/>
-        </w:rPr>
-      </w:pPr>
-    </w:p>
-    <w:p>
-      <w:pPr>
-        <w:pStyle w:val="ListParagraph"/>
-        <w:numPr>
-          <w:ilvl w:val="0"/>
-          <w:numId w:val="1"/>
-        </w:numPr>
-      </w:pPr>
-      <w:r>
-        <w:t>M186, tutti: Missing time signature, please add 2/4</w:t>
-      </w:r>
+        <w:t xml:space="preserve"> for these </w:t>
+      </w:r>
+      <w:proofErr w:type="gramStart"/>
+      <w:r>
+        <w:t>bars</w:t>
+      </w:r>
+      <w:proofErr w:type="gramEnd"/>
+    </w:p>
+    <w:p>
+      <w:pPr>
+        <w:pStyle w:val="ListParagraph"/>
+      </w:pPr>
+    </w:p>
+    <w:p>
+      <w:pPr>
+        <w:pStyle w:val="ListParagraph"/>
+        <w:numPr>
+          <w:ilvl w:val="0"/>
+          <w:numId w:val="1"/>
+        </w:numPr>
+      </w:pPr>
+      <w:r>
+        <w:t xml:space="preserve">M184-185: Make measure size more homogeneous for these </w:t>
+      </w:r>
+      <w:proofErr w:type="gramStart"/>
+      <w:r>
+        <w:t>bars</w:t>
+      </w:r>
+      <w:proofErr w:type="gramEnd"/>
+    </w:p>
+    <w:p>
+      <w:pPr>
+        <w:pStyle w:val="ListParagraph"/>
+        <w:rPr>
+          <w:b/>
+          <w:bCs/>
+        </w:rPr>
+      </w:pPr>
+    </w:p>
+    <w:p>
+      <w:pPr>
+        <w:pStyle w:val="ListParagraph"/>
+        <w:numPr>
+          <w:ilvl w:val="0"/>
+          <w:numId w:val="1"/>
+        </w:numPr>
+      </w:pPr>
+      <w:r>
+        <w:t xml:space="preserve">M186, tutti: Missing time signature, please add </w:t>
+      </w:r>
+      <w:proofErr w:type="gramStart"/>
+      <w:r>
+        <w:t>2/4</w:t>
+      </w:r>
+      <w:proofErr w:type="gramEnd"/>
     </w:p>
     <w:p>
       <w:pPr>
@@ -552,29 +525,42 @@
       </w:r>
       <w:proofErr w:type="spellEnd"/>
       <w:r>
-        <w:t>” and with normal notehead, Also add downbow symbol</w:t>
-      </w:r>
-    </w:p>
-    <w:p>
-      <w:pPr>
-        <w:pStyle w:val="ListParagraph"/>
-        <w:rPr>
-          <w:b/>
-          <w:bCs/>
-        </w:rPr>
-      </w:pPr>
-    </w:p>
-    <w:p>
-      <w:pPr>
-        <w:pStyle w:val="ListParagraph"/>
-        <w:numPr>
-          <w:ilvl w:val="0"/>
-          <w:numId w:val="1"/>
-        </w:numPr>
-      </w:pPr>
-      <w:r>
-        <w:t>M188, flute: make G# into G3/4 sharp…Also, oboe should be F1/4 flat</w:t>
-      </w:r>
+        <w:t xml:space="preserve">” and with normal notehead, </w:t>
+      </w:r>
+      <w:proofErr w:type="gramStart"/>
+      <w:r>
+        <w:t>Also</w:t>
+      </w:r>
+      <w:proofErr w:type="gramEnd"/>
+      <w:r>
+        <w:t xml:space="preserve"> add downbow symbol</w:t>
+      </w:r>
+    </w:p>
+    <w:p>
+      <w:pPr>
+        <w:pStyle w:val="ListParagraph"/>
+        <w:rPr>
+          <w:b/>
+          <w:bCs/>
+        </w:rPr>
+      </w:pPr>
+    </w:p>
+    <w:p>
+      <w:pPr>
+        <w:pStyle w:val="ListParagraph"/>
+        <w:numPr>
+          <w:ilvl w:val="0"/>
+          <w:numId w:val="1"/>
+        </w:numPr>
+      </w:pPr>
+      <w:r>
+        <w:t xml:space="preserve">M188, flute: make G# into G3/4 sharp…Also, oboe should be F1/4 </w:t>
+      </w:r>
+      <w:proofErr w:type="gramStart"/>
+      <w:r>
+        <w:t>flat</w:t>
+      </w:r>
+      <w:proofErr w:type="gramEnd"/>
     </w:p>
     <w:p>
       <w:pPr>
@@ -644,29 +630,39 @@
       </w:r>
       <w:proofErr w:type="spellEnd"/>
       <w:r>
-        <w:t>)” to Woodblocks</w:t>
-      </w:r>
-    </w:p>
-    <w:p>
-      <w:pPr>
-        <w:pStyle w:val="ListParagraph"/>
-        <w:rPr>
-          <w:b/>
-          <w:bCs/>
-        </w:rPr>
-      </w:pPr>
-    </w:p>
-    <w:p>
-      <w:pPr>
-        <w:pStyle w:val="ListParagraph"/>
-        <w:numPr>
-          <w:ilvl w:val="0"/>
-          <w:numId w:val="1"/>
-        </w:numPr>
-      </w:pPr>
-      <w:r>
-        <w:t>M202, Perc 2: add “use rattan for accented notes and regular mallet for unaccented</w:t>
-      </w:r>
+        <w:t xml:space="preserve">)” to </w:t>
+      </w:r>
+      <w:proofErr w:type="gramStart"/>
+      <w:r>
+        <w:t>Woodblocks</w:t>
+      </w:r>
+      <w:proofErr w:type="gramEnd"/>
+    </w:p>
+    <w:p>
+      <w:pPr>
+        <w:pStyle w:val="ListParagraph"/>
+        <w:rPr>
+          <w:b/>
+          <w:bCs/>
+        </w:rPr>
+      </w:pPr>
+    </w:p>
+    <w:p>
+      <w:pPr>
+        <w:pStyle w:val="ListParagraph"/>
+        <w:numPr>
+          <w:ilvl w:val="0"/>
+          <w:numId w:val="1"/>
+        </w:numPr>
+      </w:pPr>
+      <w:r>
+        <w:t xml:space="preserve">M202, Perc 2: add “use rattan for accented notes and regular mallet for </w:t>
+      </w:r>
+      <w:proofErr w:type="gramStart"/>
+      <w:r>
+        <w:t>unaccented</w:t>
+      </w:r>
+      <w:proofErr w:type="gramEnd"/>
       <w:r>
         <w:t>”</w:t>
       </w:r>
@@ -712,165 +708,180 @@
       </w:r>
       <w:proofErr w:type="spellEnd"/>
       <w:r>
+        <w:t xml:space="preserve"> </w:t>
+      </w:r>
+      <w:proofErr w:type="gramStart"/>
+      <w:r>
+        <w:t>downbeat</w:t>
+      </w:r>
+      <w:proofErr w:type="gramEnd"/>
+    </w:p>
+    <w:p>
+      <w:pPr>
+        <w:pStyle w:val="ListParagraph"/>
+        <w:rPr>
+          <w:b/>
+          <w:bCs/>
+        </w:rPr>
+      </w:pPr>
+    </w:p>
+    <w:p>
+      <w:pPr>
+        <w:pStyle w:val="ListParagraph"/>
+        <w:numPr>
+          <w:ilvl w:val="0"/>
+          <w:numId w:val="1"/>
+        </w:numPr>
+      </w:pPr>
+      <w:r>
+        <w:t xml:space="preserve">M212, flute, clarinet, sax: add “ff” just before </w:t>
+      </w:r>
+      <w:proofErr w:type="spellStart"/>
+      <w:r>
+        <w:t>barline</w:t>
+      </w:r>
+      <w:proofErr w:type="spellEnd"/>
+      <w:r>
+        <w:t xml:space="preserve"> of M213, so they </w:t>
+      </w:r>
+      <w:proofErr w:type="spellStart"/>
+      <w:r>
+        <w:t>cresc</w:t>
+      </w:r>
+      <w:proofErr w:type="spellEnd"/>
+      <w:r>
+        <w:t xml:space="preserve"> to ff before </w:t>
+      </w:r>
+      <w:proofErr w:type="spellStart"/>
+      <w:r>
+        <w:t>sfzp</w:t>
+      </w:r>
+      <w:proofErr w:type="spellEnd"/>
+      <w:r>
         <w:t xml:space="preserve"> downbeat</w:t>
       </w:r>
-    </w:p>
-    <w:p>
-      <w:pPr>
-        <w:pStyle w:val="ListParagraph"/>
-        <w:rPr>
-          <w:b/>
-          <w:bCs/>
-        </w:rPr>
-      </w:pPr>
-    </w:p>
-    <w:p>
-      <w:pPr>
-        <w:pStyle w:val="ListParagraph"/>
-        <w:numPr>
-          <w:ilvl w:val="0"/>
-          <w:numId w:val="1"/>
-        </w:numPr>
-      </w:pPr>
-      <w:r>
-        <w:t xml:space="preserve">M212, flute, clarinet, sax: add “ff” just before </w:t>
+      <w:r>
+        <w:br/>
+      </w:r>
+    </w:p>
+    <w:p>
+      <w:pPr>
+        <w:pStyle w:val="ListParagraph"/>
+        <w:numPr>
+          <w:ilvl w:val="0"/>
+          <w:numId w:val="1"/>
+        </w:numPr>
+      </w:pPr>
+      <w:r>
+        <w:t xml:space="preserve">M212, oboe: add “f” to beat 3, then crescendo to “ff” on last note…delete current dynamics. </w:t>
+      </w:r>
+    </w:p>
+    <w:p>
+      <w:pPr>
+        <w:rPr>
+          <w:b/>
+          <w:bCs/>
+        </w:rPr>
+      </w:pPr>
+    </w:p>
+    <w:p>
+      <w:pPr>
+        <w:pStyle w:val="ListParagraph"/>
+        <w:numPr>
+          <w:ilvl w:val="0"/>
+          <w:numId w:val="1"/>
+        </w:numPr>
+      </w:pPr>
+      <w:r>
+        <w:t xml:space="preserve">M213, oboe: make downbeat </w:t>
       </w:r>
       <w:proofErr w:type="spellStart"/>
       <w:r>
-        <w:t>barline</w:t>
+        <w:t>sfzp</w:t>
       </w:r>
       <w:proofErr w:type="spellEnd"/>
       <w:r>
-        <w:t xml:space="preserve"> of M213, so they </w:t>
+        <w:t xml:space="preserve"> like other </w:t>
+      </w:r>
+      <w:proofErr w:type="gramStart"/>
+      <w:r>
+        <w:t>parts</w:t>
+      </w:r>
+      <w:proofErr w:type="gramEnd"/>
+    </w:p>
+    <w:p>
+      <w:pPr>
+        <w:pStyle w:val="ListParagraph"/>
+        <w:rPr>
+          <w:b/>
+          <w:bCs/>
+        </w:rPr>
+      </w:pPr>
+    </w:p>
+    <w:p>
+      <w:pPr>
+        <w:pStyle w:val="ListParagraph"/>
+        <w:numPr>
+          <w:ilvl w:val="0"/>
+          <w:numId w:val="1"/>
+        </w:numPr>
+      </w:pPr>
+      <w:r>
+        <w:t xml:space="preserve">M213, viola: should be whole </w:t>
+      </w:r>
+      <w:proofErr w:type="gramStart"/>
+      <w:r>
+        <w:t>note</w:t>
+      </w:r>
+      <w:proofErr w:type="gramEnd"/>
+    </w:p>
+    <w:p>
+      <w:pPr>
+        <w:pStyle w:val="ListParagraph"/>
+        <w:rPr>
+          <w:b/>
+          <w:bCs/>
+        </w:rPr>
+      </w:pPr>
+    </w:p>
+    <w:p>
+      <w:pPr>
+        <w:pStyle w:val="ListParagraph"/>
+        <w:numPr>
+          <w:ilvl w:val="0"/>
+          <w:numId w:val="1"/>
+        </w:numPr>
+      </w:pPr>
+      <w:r>
+        <w:t>M213, Percussion 1 and 2: write “regular mallet (no more rattan)”</w:t>
+      </w:r>
+    </w:p>
+    <w:p>
+      <w:pPr>
+        <w:pStyle w:val="ListParagraph"/>
+        <w:rPr>
+          <w:b/>
+          <w:bCs/>
+        </w:rPr>
+      </w:pPr>
+    </w:p>
+    <w:p>
+      <w:pPr>
+        <w:pStyle w:val="ListParagraph"/>
+        <w:numPr>
+          <w:ilvl w:val="0"/>
+          <w:numId w:val="1"/>
+        </w:numPr>
+      </w:pPr>
+      <w:r>
+        <w:t xml:space="preserve">M215-236, Percussion 1: substitute every G (if it was treble clef) Wood Block with an A (if treble clef) Tom </w:t>
       </w:r>
       <w:proofErr w:type="spellStart"/>
       <w:r>
-        <w:t>cresc</w:t>
+        <w:t>Tom</w:t>
       </w:r>
       <w:proofErr w:type="spellEnd"/>
       <w:r>
-        <w:t xml:space="preserve"> to ff before </w:t>
-      </w:r>
-      <w:proofErr w:type="spellStart"/>
-      <w:r>
-        <w:t>sfzp</w:t>
-      </w:r>
-      <w:proofErr w:type="spellEnd"/>
-      <w:r>
-        <w:t xml:space="preserve"> downbeat</w:t>
-      </w:r>
-      <w:r>
-        <w:br/>
-      </w:r>
-    </w:p>
-    <w:p>
-      <w:pPr>
-        <w:pStyle w:val="ListParagraph"/>
-        <w:numPr>
-          <w:ilvl w:val="0"/>
-          <w:numId w:val="1"/>
-        </w:numPr>
-      </w:pPr>
-      <w:r>
-        <w:t xml:space="preserve">M212, oboe: add “f” to beat 3, then crescendo to “ff” on last note…delete current dynamics. </w:t>
-      </w:r>
-    </w:p>
-    <w:p>
-      <w:pPr>
-        <w:rPr>
-          <w:b/>
-          <w:bCs/>
-        </w:rPr>
-      </w:pPr>
-    </w:p>
-    <w:p>
-      <w:pPr>
-        <w:pStyle w:val="ListParagraph"/>
-        <w:numPr>
-          <w:ilvl w:val="0"/>
-          <w:numId w:val="1"/>
-        </w:numPr>
-      </w:pPr>
-      <w:r>
-        <w:t xml:space="preserve">M213, oboe: make downbeat </w:t>
-      </w:r>
-      <w:proofErr w:type="spellStart"/>
-      <w:r>
-        <w:t>sfzp</w:t>
-      </w:r>
-      <w:proofErr w:type="spellEnd"/>
-      <w:r>
-        <w:t xml:space="preserve"> like other parts</w:t>
-      </w:r>
-    </w:p>
-    <w:p>
-      <w:pPr>
-        <w:pStyle w:val="ListParagraph"/>
-        <w:rPr>
-          <w:b/>
-          <w:bCs/>
-        </w:rPr>
-      </w:pPr>
-    </w:p>
-    <w:p>
-      <w:pPr>
-        <w:pStyle w:val="ListParagraph"/>
-        <w:numPr>
-          <w:ilvl w:val="0"/>
-          <w:numId w:val="1"/>
-        </w:numPr>
-      </w:pPr>
-      <w:r>
-        <w:t>M213, viola: should be whole note</w:t>
-      </w:r>
-    </w:p>
-    <w:p>
-      <w:pPr>
-        <w:pStyle w:val="ListParagraph"/>
-        <w:rPr>
-          <w:b/>
-          <w:bCs/>
-        </w:rPr>
-      </w:pPr>
-    </w:p>
-    <w:p>
-      <w:pPr>
-        <w:pStyle w:val="ListParagraph"/>
-        <w:numPr>
-          <w:ilvl w:val="0"/>
-          <w:numId w:val="1"/>
-        </w:numPr>
-      </w:pPr>
-      <w:r>
-        <w:t>M213, Percussion 1 and 2: write “regular mallet (no more rattan)”</w:t>
-      </w:r>
-    </w:p>
-    <w:p>
-      <w:pPr>
-        <w:pStyle w:val="ListParagraph"/>
-        <w:rPr>
-          <w:b/>
-          <w:bCs/>
-        </w:rPr>
-      </w:pPr>
-    </w:p>
-    <w:p>
-      <w:pPr>
-        <w:pStyle w:val="ListParagraph"/>
-        <w:numPr>
-          <w:ilvl w:val="0"/>
-          <w:numId w:val="1"/>
-        </w:numPr>
-      </w:pPr>
-      <w:r>
-        <w:t xml:space="preserve">M215-236, Percussion 1: substitute every G (if it was treble clef) Wood Block with an A (if treble clef) Tom </w:t>
-      </w:r>
-      <w:proofErr w:type="spellStart"/>
-      <w:r>
-        <w:t>Tom</w:t>
-      </w:r>
-      <w:proofErr w:type="spellEnd"/>
-      <w:r>
         <w:t>. This should happen in M215, 219, 223, 227, 231, 235.</w:t>
       </w:r>
     </w:p>
@@ -892,29 +903,42 @@
         </w:numPr>
       </w:pPr>
       <w:r>
-        <w:t>M219, woodwinds: wrong note….first attack should be F 1/6 flat…not F flat 1/6 flat</w:t>
-      </w:r>
-    </w:p>
-    <w:p>
-      <w:pPr>
-        <w:pStyle w:val="ListParagraph"/>
-        <w:rPr>
-          <w:b/>
-          <w:bCs/>
-        </w:rPr>
-      </w:pPr>
-    </w:p>
-    <w:p>
-      <w:pPr>
-        <w:pStyle w:val="ListParagraph"/>
-        <w:numPr>
-          <w:ilvl w:val="0"/>
-          <w:numId w:val="1"/>
-        </w:numPr>
-      </w:pPr>
-      <w:r>
-        <w:t>M225: woodwinds: add natural accidental to B</w:t>
-      </w:r>
+        <w:t>M219, woodwinds: wrong note</w:t>
+      </w:r>
+      <w:proofErr w:type="gramStart"/>
+      <w:r>
+        <w:t>….first</w:t>
+      </w:r>
+      <w:proofErr w:type="gramEnd"/>
+      <w:r>
+        <w:t xml:space="preserve"> attack should be F 1/6 flat…not F flat 1/6 flat</w:t>
+      </w:r>
+    </w:p>
+    <w:p>
+      <w:pPr>
+        <w:pStyle w:val="ListParagraph"/>
+        <w:rPr>
+          <w:b/>
+          <w:bCs/>
+        </w:rPr>
+      </w:pPr>
+    </w:p>
+    <w:p>
+      <w:pPr>
+        <w:pStyle w:val="ListParagraph"/>
+        <w:numPr>
+          <w:ilvl w:val="0"/>
+          <w:numId w:val="1"/>
+        </w:numPr>
+      </w:pPr>
+      <w:r>
+        <w:t xml:space="preserve">M225: woodwinds: add natural accidental to </w:t>
+      </w:r>
+      <w:proofErr w:type="gramStart"/>
+      <w:r>
+        <w:t>B</w:t>
+      </w:r>
+      <w:proofErr w:type="gramEnd"/>
     </w:p>
     <w:p>
       <w:pPr>
@@ -943,8 +967,13 @@
         <w:t>th</w:t>
       </w:r>
       <w:r>
-        <w:t xml:space="preserve"> partial)” above</w:t>
-      </w:r>
+        <w:t xml:space="preserve"> partial)” </w:t>
+      </w:r>
+      <w:proofErr w:type="gramStart"/>
+      <w:r>
+        <w:t>above</w:t>
+      </w:r>
+      <w:proofErr w:type="gramEnd"/>
     </w:p>
     <w:p>
       <w:pPr>
@@ -1012,104 +1041,172 @@
       </w:pPr>
       <w:r>
         <w:lastRenderedPageBreak/>
-        <w:t>m 7, beat 4 -  missing note (plank 3 on beat 4 downbeat)</w:t>
-      </w:r>
-    </w:p>
-    <w:p>
-      <w:pPr>
-        <w:pStyle w:val="ListParagraph"/>
-      </w:pPr>
-      <w:r>
-        <w:t>m. 37, beat 2 - should be plank 2</w:t>
-      </w:r>
-    </w:p>
-    <w:p>
-      <w:pPr>
-        <w:pStyle w:val="ListParagraph"/>
-      </w:pPr>
-      <w:r>
-        <w:t>m. 39, beat 4 - should be plank 2</w:t>
-      </w:r>
-    </w:p>
-    <w:p>
-      <w:pPr>
-        <w:pStyle w:val="ListParagraph"/>
-      </w:pPr>
-      <w:r>
-        <w:t>m. 130, beat 2 - should be block 5</w:t>
-      </w:r>
-    </w:p>
-    <w:p>
-      <w:pPr>
-        <w:pStyle w:val="ListParagraph"/>
-      </w:pPr>
-      <w:r>
-        <w:t>m. 130, beat 3 - should be block 3</w:t>
-      </w:r>
-    </w:p>
-    <w:p>
-      <w:pPr>
-        <w:pStyle w:val="ListParagraph"/>
-      </w:pPr>
-      <w:r>
-        <w:t>m. 151, beat 3 - should be block 5</w:t>
-      </w:r>
-    </w:p>
-    <w:p>
-      <w:pPr>
-        <w:pStyle w:val="ListParagraph"/>
-      </w:pPr>
-      <w:r>
-        <w:t>m. 151, beat 4 - should be block 3</w:t>
-      </w:r>
-    </w:p>
-    <w:p>
-      <w:pPr>
-        <w:pStyle w:val="ListParagraph"/>
-      </w:pPr>
-      <w:r>
-        <w:t>m. 164, beat 3 - should be plank 1</w:t>
-      </w:r>
-    </w:p>
-    <w:p>
-      <w:pPr>
-        <w:pStyle w:val="ListParagraph"/>
-      </w:pPr>
-      <w:r>
-        <w:t>m. 166, beat 2 - 2nd note should be plank 3</w:t>
-      </w:r>
-    </w:p>
-    <w:p>
-      <w:pPr>
-        <w:pStyle w:val="ListParagraph"/>
-      </w:pPr>
-      <w:r>
-        <w:t>m. 167, beat 4 - 2nd note should be plank 2</w:t>
-      </w:r>
-    </w:p>
-    <w:p>
-      <w:pPr>
-        <w:pStyle w:val="ListParagraph"/>
-      </w:pPr>
-      <w:r>
-        <w:t>m. 184, beats 1 and 2 - both planks and blocks should be on staff lines, not spaces</w:t>
-      </w:r>
-    </w:p>
-    <w:p>
-      <w:pPr>
-        <w:pStyle w:val="ListParagraph"/>
-      </w:pPr>
-      <w:r>
-        <w:t>m. 204, beat 3 - should be block 5</w:t>
-      </w:r>
-    </w:p>
-    <w:p>
-      <w:pPr>
-        <w:pStyle w:val="ListParagraph"/>
-      </w:pPr>
-      <w:r>
-        <w:t>m. 204, beat 4 - should be block 3</w:t>
-      </w:r>
+        <w:t xml:space="preserve">m 7, beat 4 </w:t>
+      </w:r>
+      <w:proofErr w:type="gramStart"/>
+      <w:r>
+        <w:t>-  missing</w:t>
+      </w:r>
+      <w:proofErr w:type="gramEnd"/>
+      <w:r>
+        <w:t xml:space="preserve"> note (plank 3 on beat 4 downbeat)</w:t>
+      </w:r>
+    </w:p>
+    <w:p>
+      <w:pPr>
+        <w:pStyle w:val="ListParagraph"/>
+      </w:pPr>
+      <w:r>
+        <w:t xml:space="preserve">m. 37, beat 2 - should be plank </w:t>
+      </w:r>
+      <w:proofErr w:type="gramStart"/>
+      <w:r>
+        <w:t>2</w:t>
+      </w:r>
+      <w:proofErr w:type="gramEnd"/>
+    </w:p>
+    <w:p>
+      <w:pPr>
+        <w:pStyle w:val="ListParagraph"/>
+      </w:pPr>
+      <w:r>
+        <w:t xml:space="preserve">m. 39, beat 4 - should be plank </w:t>
+      </w:r>
+      <w:proofErr w:type="gramStart"/>
+      <w:r>
+        <w:t>2</w:t>
+      </w:r>
+      <w:proofErr w:type="gramEnd"/>
+    </w:p>
+    <w:p>
+      <w:pPr>
+        <w:pStyle w:val="ListParagraph"/>
+      </w:pPr>
+      <w:r>
+        <w:t xml:space="preserve">m. 130, beat 2 - should be block </w:t>
+      </w:r>
+      <w:proofErr w:type="gramStart"/>
+      <w:r>
+        <w:t>5</w:t>
+      </w:r>
+      <w:proofErr w:type="gramEnd"/>
+    </w:p>
+    <w:p>
+      <w:pPr>
+        <w:pStyle w:val="ListParagraph"/>
+      </w:pPr>
+      <w:r>
+        <w:t xml:space="preserve">m. 130, beat 3 - should be block </w:t>
+      </w:r>
+      <w:proofErr w:type="gramStart"/>
+      <w:r>
+        <w:t>3</w:t>
+      </w:r>
+      <w:proofErr w:type="gramEnd"/>
+    </w:p>
+    <w:p>
+      <w:pPr>
+        <w:pStyle w:val="ListParagraph"/>
+      </w:pPr>
+      <w:r>
+        <w:t xml:space="preserve">m. 151, beat 3 - should be block </w:t>
+      </w:r>
+      <w:proofErr w:type="gramStart"/>
+      <w:r>
+        <w:t>5</w:t>
+      </w:r>
+      <w:proofErr w:type="gramEnd"/>
+    </w:p>
+    <w:p>
+      <w:pPr>
+        <w:pStyle w:val="ListParagraph"/>
+      </w:pPr>
+      <w:r>
+        <w:t xml:space="preserve">m. 151, beat 4 - should be block </w:t>
+      </w:r>
+      <w:proofErr w:type="gramStart"/>
+      <w:r>
+        <w:t>3</w:t>
+      </w:r>
+      <w:proofErr w:type="gramEnd"/>
+    </w:p>
+    <w:p>
+      <w:pPr>
+        <w:pStyle w:val="ListParagraph"/>
+      </w:pPr>
+      <w:r>
+        <w:t xml:space="preserve">m. 164, beat 3 - should be plank </w:t>
+      </w:r>
+      <w:proofErr w:type="gramStart"/>
+      <w:r>
+        <w:t>1</w:t>
+      </w:r>
+      <w:proofErr w:type="gramEnd"/>
+    </w:p>
+    <w:p>
+      <w:pPr>
+        <w:pStyle w:val="ListParagraph"/>
+      </w:pPr>
+      <w:r>
+        <w:t xml:space="preserve">m. 166, beat 2 - 2nd note should be plank </w:t>
+      </w:r>
+      <w:proofErr w:type="gramStart"/>
+      <w:r>
+        <w:t>3</w:t>
+      </w:r>
+      <w:proofErr w:type="gramEnd"/>
+    </w:p>
+    <w:p>
+      <w:pPr>
+        <w:pStyle w:val="ListParagraph"/>
+      </w:pPr>
+      <w:r>
+        <w:t xml:space="preserve">m. 167, beat 4 - 2nd note should be plank </w:t>
+      </w:r>
+      <w:proofErr w:type="gramStart"/>
+      <w:r>
+        <w:t>2</w:t>
+      </w:r>
+      <w:proofErr w:type="gramEnd"/>
+    </w:p>
+    <w:p>
+      <w:pPr>
+        <w:pStyle w:val="ListParagraph"/>
+      </w:pPr>
+      <w:r>
+        <w:t xml:space="preserve">m. 184, beats 1 and 2 - both planks and blocks should be on staff lines, not </w:t>
+      </w:r>
+      <w:proofErr w:type="gramStart"/>
+      <w:r>
+        <w:t>spaces</w:t>
+      </w:r>
+      <w:proofErr w:type="gramEnd"/>
+    </w:p>
+    <w:p>
+      <w:pPr>
+        <w:pStyle w:val="ListParagraph"/>
+      </w:pPr>
+      <w:r>
+        <w:t xml:space="preserve">m. 204, beat 3 - should be block </w:t>
+      </w:r>
+      <w:proofErr w:type="gramStart"/>
+      <w:r>
+        <w:t>5</w:t>
+      </w:r>
+      <w:proofErr w:type="gramEnd"/>
+    </w:p>
+    <w:p>
+      <w:pPr>
+        <w:pStyle w:val="ListParagraph"/>
+      </w:pPr>
+      <w:r>
+        <w:t xml:space="preserve">m. 204, beat 4 - should be block </w:t>
+      </w:r>
+      <w:proofErr w:type="gramStart"/>
+      <w:r>
+        <w:t>3</w:t>
+      </w:r>
+      <w:proofErr w:type="gramEnd"/>
     </w:p>
     <w:p>
       <w:pPr>
@@ -1158,15 +1255,16 @@
           <w:bCs/>
           <w:color w:val="FF0000"/>
         </w:rPr>
-        <w:t>This is the Percussionists suggestion for a final version</w:t>
-      </w:r>
+        <w:t xml:space="preserve">This is the Percussionists suggestion for a final </w:t>
+      </w:r>
+      <w:proofErr w:type="gramStart"/>
       <w:r>
         <w:rPr>
           <w:b/>
           <w:bCs/>
           <w:color w:val="FF0000"/>
         </w:rPr>
-        <w:t>; my comments in red</w:t>
+        <w:t>version</w:t>
       </w:r>
       <w:r>
         <w:rPr>
@@ -1174,6 +1272,23 @@
           <w:bCs/>
           <w:color w:val="FF0000"/>
         </w:rPr>
+        <w:t>;</w:t>
+      </w:r>
+      <w:proofErr w:type="gramEnd"/>
+      <w:r>
+        <w:rPr>
+          <w:b/>
+          <w:bCs/>
+          <w:color w:val="FF0000"/>
+        </w:rPr>
+        <w:t xml:space="preserve"> my comments in red</w:t>
+      </w:r>
+      <w:r>
+        <w:rPr>
+          <w:b/>
+          <w:bCs/>
+          <w:color w:val="FF0000"/>
+        </w:rPr>
         <w:t>!</w:t>
       </w:r>
     </w:p>
@@ -1222,7 +1337,25 @@
           <w:kern w:val="0"/>
           <w14:ligatures w14:val="none"/>
         </w:rPr>
-        <w:t>The toms are also treated like the planks and blocks and would be much easier to read if they were on the same 5 staff lines, rather than the spaces above the lines. (If you firmly believe in the spaces then I would bring the drums down one space each so they are written below the woods, because they certainly sound lower!)</w:t>
+        <w:t xml:space="preserve">The toms are also treated like the planks and blocks and would be much easier to read if they were on the same 5 staff lines, rather than the spaces above the lines. (If you firmly believe in the spaces then I would bring the drums down one space </w:t>
+      </w:r>
+      <w:proofErr w:type="gramStart"/>
+      <w:r>
+        <w:rPr>
+          <w:rFonts w:ascii="Times New Roman" w:eastAsia="Times New Roman" w:hAnsi="Times New Roman" w:cs="Times New Roman"/>
+          <w:kern w:val="0"/>
+          <w14:ligatures w14:val="none"/>
+        </w:rPr>
+        <w:t>each</w:t>
+      </w:r>
+      <w:proofErr w:type="gramEnd"/>
+      <w:r>
+        <w:rPr>
+          <w:rFonts w:ascii="Times New Roman" w:eastAsia="Times New Roman" w:hAnsi="Times New Roman" w:cs="Times New Roman"/>
+          <w:kern w:val="0"/>
+          <w14:ligatures w14:val="none"/>
+        </w:rPr>
+        <w:t xml:space="preserve"> so they are written below the woods, because they certainly sound lower!)</w:t>
       </w:r>
     </w:p>
     <w:p>
@@ -1317,8 +1450,18 @@
           <w:kern w:val="0"/>
           <w14:ligatures w14:val="none"/>
         </w:rPr>
-        <w:t>square-noteheads for blocks</w:t>
-      </w:r>
+        <w:t xml:space="preserve">square-noteheads for </w:t>
+      </w:r>
+      <w:proofErr w:type="gramStart"/>
+      <w:r>
+        <w:rPr>
+          <w:rFonts w:ascii="Times New Roman" w:eastAsia="Times New Roman" w:hAnsi="Times New Roman" w:cs="Times New Roman"/>
+          <w:kern w:val="0"/>
+          <w14:ligatures w14:val="none"/>
+        </w:rPr>
+        <w:t>blocks</w:t>
+      </w:r>
+      <w:proofErr w:type="gramEnd"/>
     </w:p>
     <w:p>
       <w:pPr>

</xml_diff>